<commit_message>
Trim Phase 2 report under 1000 words
</commit_message>
<xml_diff>
--- a/term_project/phase2/phase2_report.docx
+++ b/term_project/phase2/phase2_report.docx
@@ -159,7 +159,7 @@
         <w:pStyle w:val="FirstParagraph"/>
       </w:pPr>
       <w:r>
-        <w:t xml:space="preserve">Own implementation (about 900 lines of Python, 500 of TypeScript) on AutoGen 0.7.5; the reference code was consulted only for how it hooks the runtime. The team under debug is a Magentic-One orchestrator with a</w:t>
+        <w:t xml:space="preserve">Own implementation (about 900 lines of Python, 500 of TypeScript) on AutoGen 0.7.5; the reference code was consulted only for its runtime hook. The team under debug is a Magentic-One orchestrator with a</w:t>
       </w:r>
       <w:r>
         <w:t xml:space="preserve"> </w:t>
@@ -204,7 +204,7 @@
         <w:t xml:space="preserve"> </w:t>
       </w:r>
       <w:r>
-        <w:t xml:space="preserve">with two web modes per task: a cached 30-page corpus (reproducible) and live Wikipedia (search plus plain-text extracts read in 3,000-character chunks, like Magentic-One’s web surfer viewport). Agents call Claude through a model client we wrote on the official SDK.</w:t>
+        <w:t xml:space="preserve">with two web modes per task: a cached 30-page corpus and live Wikipedia (search plus plain-text extracts read in 3,000-character chunks).</w:t>
       </w:r>
     </w:p>
     <w:p>
@@ -262,7 +262,7 @@
         <w:t xml:space="preserve"> </w:t>
       </w:r>
       <w:r>
-        <w:t xml:space="preserve">the message is processed, so every agent’s context and the orchestrator’s ledger can be restored at any timestamp. Runs are saved as recordings and replay without model calls.</w:t>
+        <w:t xml:space="preserve">the message is processed, so every agent’s context can be restored at any timestamp. Runs are saved as recordings and replay without model calls.</w:t>
       </w:r>
     </w:p>
     <w:p>
@@ -280,7 +280,7 @@
         <w:t xml:space="preserve"> </w:t>
       </w:r>
       <w:r>
-        <w:t xml:space="preserve">Cards show sender, recipient or topic, type, source and payload, tool calls included. The compose panel sends a broadcast, a direct request-to-speak, or a new task; the queue panel lists pending envelopes with</w:t>
+        <w:t xml:space="preserve">Cards show sender, recipient or topic, type and payload, tool calls included. The compose panel sends a broadcast, a direct request-to-speak, or a new task; the queue panel offers</w:t>
       </w:r>
       <w:r>
         <w:t xml:space="preserve"> </w:t>
@@ -379,7 +379,7 @@
         <w:t xml:space="preserve"> </w:t>
       </w:r>
       <w:r>
-        <w:t xml:space="preserve">stop the runtime, clear the queue, snapshot the session, restore the checkpoint taken before that timestamp, re-publish the (edited) message with the rest of the burst its handler emitted (the orchestrator’s follow-up request-to-speak) and continue in a new session; earlier branches stay viewable via session tabs. Two details the paper leaves open: the burst replay, and writing the edit into the sender’s own saved state (its message thread; for the orchestrator’s plan message also its stored facts and plan) — otherwise the orchestrator keeps acting on the text it remembers, as we observed.</w:t>
+        <w:t xml:space="preserve">stop the runtime, clear the queue, snapshot the session, restore the checkpoint taken before that timestamp, re-publish the (edited) message with the rest of the burst its handler emitted (the orchestrator’s follow-up request-to-speak) and continue in a new session; earlier branches stay viewable via session tabs. Two details the paper leaves open: the burst replay, and writing the edit into the sender’s own saved state (message thread, and the orchestrator’s stored facts and plan) — otherwise the orchestrator keeps acting on the text it remembers.</w:t>
       </w:r>
       <w:r>
         <w:t xml:space="preserve"> </w:t>
@@ -429,7 +429,7 @@
         <w:t xml:space="preserve"> </w:t>
       </w:r>
       <w:r>
-        <w:t xml:space="preserve">plain SVG with D3 scales, no zooming; AutoGen’s relay copies to its output topic are hidden.</w:t>
+        <w:t xml:space="preserve">plain SVG with D3 scales, no zooming.</w:t>
       </w:r>
     </w:p>
     <w:p>
@@ -463,7 +463,7 @@
         <w:t xml:space="preserve"> </w:t>
       </w:r>
       <w:r>
-        <w:t xml:space="preserve">Claude Opus 5.5 was correct in 97 of 97 runs (60 corpus, 37 Wikipedia) at default and low effort — none of the paper’s failure modes appeared. Claude Haiku 5.5 at low effort fails naturally — 4 of 84 runs: three 228–235-message stalls on the financial-year task and one 224-message stall on a Wikipedia table question — so the team under debug is Haiku, as the paper’s was the then-current GPT-4o. The recorded failure in the video (</w:t>
+        <w:t xml:space="preserve">Claude Opus 5.5 was correct in 97 of 97 runs at default and low effort — none of the paper’s failure modes appeared. Claude Haiku 5.5 at low effort fails naturally — 4 of 84 runs: three 228–235-message stalls on the financial-year task and one 224-message stall on a Wikipedia table question — so the team under debug is Haiku, as the paper’s was the then-current GPT-4o. The recorded failure in the video (</w:t>
       </w:r>
       <w:r>
         <w:rPr>
@@ -472,7 +472,7 @@
         <w:t xml:space="preserve">t13_fy_ratio_FAIL</w:t>
       </w:r>
       <w:r>
-        <w:t xml:space="preserve">, 228 messages) is textbook: the orchestrator’s plan assumes a published financial-year total and forbids estimating; the searcher finds the monthly tables but reports</w:t>
+        <w:t xml:space="preserve">, 228 messages): the orchestrator’s plan assumes a published financial-year total and forbids estimating; the searcher finds the monthly tables but reports</w:t>
       </w:r>
       <w:r>
         <w:t xml:space="preserve"> </w:t>
@@ -481,7 +481,7 @@
         <w:t xml:space="preserve">“not found”</w:t>
       </w:r>
       <w:r>
-        <w:t xml:space="preserve">; the orchestrator stalls, re-plans 22 times and gives up. Editing the plan message steers the same team to the answer in 23 messages.</w:t>
+        <w:t xml:space="preserve">; the orchestrator re-plans 22 times and gives up. Editing the plan message steers the same team to the answer in 23 messages.</w:t>
       </w:r>
     </w:p>
     <w:p>
@@ -499,7 +499,7 @@
         <w:t xml:space="preserve"> </w:t>
       </w:r>
       <w:r>
-        <w:t xml:space="preserve">(1) AutoGen’s Anthropic client crashed on the current SDK; our replacement also replays reasoning blocks with tool calls. (2) Checkpoints are keyed by agent id, which embeds a random team id; recordings pin it. (3) Claude rejects replayed reasoning once the conversation prefix changes — exactly what reset-and-edit does — so the client asks the API to drop stale blocks. (4) In AutoGen’s tool-reflection step (no tools in the request) the model answered with reasoning only; the client now renders earlier tool calls as text. (5) Two</w:t>
+        <w:t xml:space="preserve">(1) AutoGen’s Anthropic client crashed on the current SDK; our replacement also replays reasoning blocks with tool calls. (2) Claude rejects replayed reasoning once the conversation prefix changes — exactly what reset-and-edit does — so the client asks the API to drop stale blocks. (3) In AutoGen’s tool-reflection step (no tools in the request) the model answered with reasoning only; the client now renders earlier tool calls as text. (4) Two</w:t>
       </w:r>
       <w:r>
         <w:t xml:space="preserve"> </w:t>
@@ -535,7 +535,7 @@
           <wp:inline>
             <wp:extent cx="5334000" cy="3333750"/>
             <wp:effectExtent b="0" l="0" r="0" t="0"/>
-            <wp:docPr descr="After steering the failing run: compose and queue panels (left), history of the forked session 1 ending in the correct answer (centre), overview with the 228-message failing session 0 and the fork marker at t=11 (right)." title="" id="12" name="Picture"/>
+            <wp:docPr descr="After steering: compose and queue panels (left), forked session 1 ending in the correct answer (centre), overview with the 228-message failing session and the fork marker (right)." title="" id="12" name="Picture"/>
             <a:graphic>
               <a:graphicData uri="http://schemas.openxmlformats.org/drawingml/2006/picture">
                 <pic:pic>
@@ -578,7 +578,7 @@
         <w:pStyle w:val="ImageCaption"/>
       </w:pPr>
       <w:r>
-        <w:t xml:space="preserve">After steering the failing run: compose and queue panels (left), history of the forked session 1 ending in the correct answer (centre), overview with the 228-message failing session 0 and the fork marker at t=11 (right).</w:t>
+        <w:t xml:space="preserve">After steering: compose and queue panels (left), forked session 1 ending in the correct answer (centre), overview with the 228-message failing session and the fork marker (right).</w:t>
       </w:r>
     </w:p>
     <w:bookmarkEnd w:id="14"/>
@@ -610,7 +610,7 @@
         <w:t xml:space="preserve"> </w:t>
       </w:r>
       <w:r>
-        <w:t xml:space="preserve">the paper’s panels and interactions are present and work on real runs; styling is simpler, no log panel.</w:t>
+        <w:t xml:space="preserve">the paper’s panels and interactions are present and work on real runs; styling is simpler.</w:t>
       </w:r>
     </w:p>
     <w:p>
@@ -632,7 +632,7 @@
         <w:t xml:space="preserve"> </w:t>
       </w:r>
       <w:r>
-        <w:t xml:space="preserve">real — genuine AutoGen runtime, real checkpoints, live model calls on steering, real code execution; no Wizard-of-Oz.</w:t>
+        <w:t xml:space="preserve">real — genuine AutoGen runtime, checkpoints, live model calls, code execution; no Wizard-of-Oz.</w:t>
       </w:r>
     </w:p>
     <w:p>
@@ -676,7 +676,7 @@
         <w:t xml:space="preserve"> </w:t>
       </w:r>
       <w:r>
-        <w:t xml:space="preserve">end to end (load recording, browse, overview-click, edit, step, run, fork); the demo video is one continuous session.</w:t>
+        <w:t xml:space="preserve">end to end (load recording, browse, overview-click, edit, step, run, fork).</w:t>
       </w:r>
     </w:p>
     <w:bookmarkEnd w:id="15"/>
@@ -779,7 +779,7 @@
         <w:rPr>
           <w:rStyle w:val="VerbatimChar"/>
         </w:rPr>
-        <w:t xml:space="preserve">MagenticOneCoderAgent</w:t>
+        <w:t xml:space="preserve">CodeExecutorAgent</w:t>
       </w:r>
       <w:r>
         <w:t xml:space="preserve">,</w:t>
@@ -791,37 +791,37 @@
         <w:rPr>
           <w:rStyle w:val="VerbatimChar"/>
         </w:rPr>
-        <w:t xml:space="preserve">CodeExecutorAgent</w:t>
-      </w:r>
-      <w:r>
-        <w:t xml:space="preserve">,</w:t>
-      </w:r>
-      <w:r>
-        <w:t xml:space="preserve"> </w:t>
+        <w:t xml:space="preserve">AssistantAgent</w:t>
+      </w:r>
+      <w:r>
+        <w:t xml:space="preserve">), Anthropic SDK 1.14 (</w:t>
       </w:r>
       <w:r>
         <w:rPr>
           <w:rStyle w:val="VerbatimChar"/>
         </w:rPr>
-        <w:t xml:space="preserve">AssistantAgent</w:t>
-      </w:r>
-      <w:r>
-        <w:t xml:space="preserve"> </w:t>
-      </w:r>
-      <w:r>
-        <w:t xml:space="preserve">with tools), Anthropic SDK 1.14 (</w:t>
+        <w:t xml:space="preserve">claude-haiku-5-5</w:t>
+      </w:r>
+      <w:r>
+        <w:t xml:space="preserve"> </w:t>
+      </w:r>
+      <w:r>
+        <w:t xml:space="preserve">under debug,</w:t>
+      </w:r>
+      <w:r>
+        <w:t xml:space="preserve"> </w:t>
       </w:r>
       <w:r>
         <w:rPr>
           <w:rStyle w:val="VerbatimChar"/>
         </w:rPr>
-        <w:t xml:space="preserve">claude-haiku-5-5</w:t>
-      </w:r>
-      <w:r>
-        <w:t xml:space="preserve"> </w:t>
-      </w:r>
-      <w:r>
-        <w:t xml:space="preserve">under debug,</w:t>
+        <w:t xml:space="preserve">claude-opus-5-5</w:t>
+      </w:r>
+      <w:r>
+        <w:t xml:space="preserve"> </w:t>
+      </w:r>
+      <w:r>
+        <w:t xml:space="preserve">for the comparison). Frontend: React 19, TypeScript, Vite, Tailwind 4, D3 scales; the UI polls</w:t>
       </w:r>
       <w:r>
         <w:t xml:space="preserve"> </w:t>
@@ -830,28 +830,13 @@
         <w:rPr>
           <w:rStyle w:val="VerbatimChar"/>
         </w:rPr>
-        <w:t xml:space="preserve">claude-opus-5-5</w:t>
-      </w:r>
-      <w:r>
-        <w:t xml:space="preserve"> </w:t>
-      </w:r>
-      <w:r>
-        <w:t xml:space="preserve">for the comparison). Frontend: React 19, TypeScript, Vite, Tailwind 4, D3 scales; the UI polls</w:t>
-      </w:r>
-      <w:r>
-        <w:t xml:space="preserve"> </w:t>
-      </w:r>
-      <w:r>
-        <w:rPr>
-          <w:rStyle w:val="VerbatimChar"/>
-        </w:rPr>
         <w:t xml:space="preserve">/api/state</w:t>
       </w:r>
       <w:r>
         <w:t xml:space="preserve"> </w:t>
       </w:r>
       <w:r>
-        <w:t xml:space="preserve">every 0.7 s. Recordings are pickles of history plus checkpoints. External services: the Claude API and the MediaWiki API.</w:t>
+        <w:t xml:space="preserve">every 0.7 s. External services: the Claude API and the MediaWiki API.</w:t>
       </w:r>
     </w:p>
     <w:bookmarkEnd w:id="19"/>
@@ -905,7 +890,7 @@
         <w:t xml:space="preserve"> </w:t>
       </w:r>
       <w:r>
-        <w:t xml:space="preserve">E1 — an LLM-as-judge pass returning ranked suspect messages with explanations, suspect markers in the overview, and a context panel (flagged message, sender–recipient chain, preceding tool calls) that pre-fills the edit box.</w:t>
+        <w:t xml:space="preserve">E1 — an LLM-as-judge pass returning ranked suspect messages, suspect markers in the overview, and a context panel (flagged message, sender–recipient chain, preceding tool calls) that pre-fills the edit box.</w:t>
       </w:r>
     </w:p>
     <w:p>
@@ -949,7 +934,7 @@
         <w:t xml:space="preserve"> </w:t>
       </w:r>
       <w:r>
-        <w:t xml:space="preserve">study, analysis, Week 13 presentation, Week 16 report; E2 only if E1 lands by Week 11.</w:t>
+        <w:t xml:space="preserve">study, analysis, presentation, report; E2 only if E1 lands by Week 11.</w:t>
       </w:r>
     </w:p>
     <w:bookmarkEnd w:id="20"/>
@@ -967,7 +952,7 @@
         <w:pStyle w:val="FirstParagraph"/>
       </w:pPr>
       <w:r>
-        <w:t xml:space="preserve">Unchanged from the proposal (Part 1 n=6 error identification, reduced / full / full+E1 on recorded failures; Part 2 n=8 live steering with Likert ratings and edit coding), with one consequence of the harvest: the team under study runs Claude Haiku 5.5, since the Opus team gave nothing to identify or steer in 97 runs; the final discussion will report this contrast.</w:t>
+        <w:t xml:space="preserve">Unchanged from the proposal (Part 1 n=6 error identification, reduced / full / full+E1 on recorded failures; Part 2 n=8 live steering with Likert ratings and edit coding), with one consequence of the harvest: the team under study runs Claude Haiku 5.5, since the Opus team gave nothing to identify or steer; the final report will discuss this contrast.</w:t>
       </w:r>
     </w:p>
     <w:bookmarkEnd w:id="21"/>

</xml_diff>